<commit_message>
Add Robus Predictor benchmark script and documentation files
</commit_message>
<xml_diff>
--- a/Documentacion/Informe_Estado_de_avance_1_V7.docx
+++ b/Documentacion/Informe_Estado_de_avance_1_V7.docx
@@ -17,12 +17,12 @@
           <wp:inline distB="114300" distT="114300" distL="114300" distR="114300">
             <wp:extent cx="5731200" cy="1409700"/>
             <wp:effectExtent b="0" l="0" r="0" t="0"/>
-            <wp:docPr id="1" name="image1.png"/>
+            <wp:docPr id="1" name="image2.png"/>
             <a:graphic>
               <a:graphicData uri="http://schemas.openxmlformats.org/drawingml/2006/picture">
                 <pic:pic>
                   <pic:nvPicPr>
-                    <pic:cNvPr id="0" name="image1.png"/>
+                    <pic:cNvPr id="0" name="image2.png"/>
                     <pic:cNvPicPr preferRelativeResize="0"/>
                   </pic:nvPicPr>
                   <pic:blipFill>
@@ -521,7 +521,7 @@
     </w:p>
     <w:sdt>
       <w:sdtPr>
-        <w:id w:val="147324540"/>
+        <w:id w:val="732884204"/>
         <w:docPartObj>
           <w:docPartGallery w:val="Table of Contents"/>
           <w:docPartUnique w:val="1"/>
@@ -844,7 +844,25 @@
                 <w:color w:val="000000"/>
                 <w:rtl w:val="0"/>
               </w:rPr>
-              <w:t xml:space="preserve">3.1 Objetivo General</w:t>
+              <w:t xml:space="preserve">3.1 </w:t>
+            </w:r>
+          </w:hyperlink>
+          <w:hyperlink w:anchor="_heading=h.j2tvfm3m5ibb">
+            <w:r>
+              <w:rPr>
+                <w:rFonts w:ascii="Calibri" w:cs="Calibri" w:eastAsia="Calibri" w:hAnsi="Calibri"/>
+                <w:rtl w:val="0"/>
+              </w:rPr>
+              <w:t xml:space="preserve">Situación inicial del cliente Formulisa</w:t>
+            </w:r>
+          </w:hyperlink>
+          <w:hyperlink w:anchor="_heading=h.j2tvfm3m5ibb">
+            <w:r>
+              <w:rPr>
+                <w:rFonts w:ascii="Calibri" w:cs="Calibri" w:eastAsia="Calibri" w:hAnsi="Calibri"/>
+                <w:color w:val="000000"/>
+                <w:rtl w:val="0"/>
+              </w:rPr>
               <w:tab/>
               <w:t xml:space="preserve">5</w:t>
             </w:r>
@@ -865,7 +883,6 @@
             <w:ind w:left="360" w:firstLine="0"/>
             <w:rPr>
               <w:rFonts w:ascii="Calibri" w:cs="Calibri" w:eastAsia="Calibri" w:hAnsi="Calibri"/>
-              <w:color w:val="000000"/>
             </w:rPr>
           </w:pPr>
           <w:hyperlink w:anchor="_heading=h.cu0qcwwbm4h3">
@@ -873,6 +890,53 @@
               <w:rPr>
                 <w:rFonts w:ascii="Calibri" w:cs="Calibri" w:eastAsia="Calibri" w:hAnsi="Calibri"/>
                 <w:color w:val="000000"/>
+                <w:rtl w:val="0"/>
+              </w:rPr>
+              <w:t xml:space="preserve">3.2 Objetivos </w:t>
+            </w:r>
+          </w:hyperlink>
+          <w:hyperlink w:anchor="_heading=h.cu0qcwwbm4h3">
+            <w:r>
+              <w:rPr>
+                <w:rFonts w:ascii="Calibri" w:cs="Calibri" w:eastAsia="Calibri" w:hAnsi="Calibri"/>
+                <w:rtl w:val="0"/>
+              </w:rPr>
+              <w:t xml:space="preserve">General</w:t>
+            </w:r>
+          </w:hyperlink>
+          <w:hyperlink w:anchor="_heading=h.cu0qcwwbm4h3">
+            <w:r>
+              <w:rPr>
+                <w:rFonts w:ascii="Calibri" w:cs="Calibri" w:eastAsia="Calibri" w:hAnsi="Calibri"/>
+                <w:color w:val="000000"/>
+                <w:rtl w:val="0"/>
+              </w:rPr>
+              <w:tab/>
+              <w:t xml:space="preserve">5</w:t>
+            </w:r>
+          </w:hyperlink>
+          <w:r>
+            <w:rPr>
+              <w:rtl w:val="0"/>
+            </w:rPr>
+          </w:r>
+        </w:p>
+        <w:p>
+          <w:pPr>
+            <w:widowControl w:val="0"/>
+            <w:tabs>
+              <w:tab w:val="right" w:leader="none" w:pos="12000"/>
+            </w:tabs>
+            <w:spacing w:before="60" w:line="240" w:lineRule="auto"/>
+            <w:ind w:left="360" w:firstLine="0"/>
+            <w:rPr>
+              <w:rFonts w:ascii="Calibri" w:cs="Calibri" w:eastAsia="Calibri" w:hAnsi="Calibri"/>
+            </w:rPr>
+          </w:pPr>
+          <w:hyperlink w:anchor="_heading=h.cu0qcwwbm4h3">
+            <w:r>
+              <w:rPr>
+                <w:rFonts w:ascii="Calibri" w:cs="Calibri" w:eastAsia="Calibri" w:hAnsi="Calibri"/>
                 <w:rtl w:val="0"/>
               </w:rPr>
               <w:t xml:space="preserve">3.2 Objetivos Específicos</w:t>
@@ -1508,7 +1572,7 @@
           <w:rFonts w:ascii="Calibri" w:cs="Calibri" w:eastAsia="Calibri" w:hAnsi="Calibri"/>
           <w:rtl w:val="0"/>
         </w:rPr>
-        <w:t xml:space="preserve">A lo largo de este documento se presenta el diagnóstico del problema planteado por el cliente, análisis del estado del arte, definiciones de objetivos, planificación, tecnologías propuestas y metodologías de trabajo.  De esta forma, se busca establecer un base para el posterior desarrollo del proyecto, asegurando una comprensión clara de los requerimientos y la propuesta de solución que será implementada en las siguientes etapas.</w:t>
+        <w:t xml:space="preserve">A lo largo de este documento se presenta el diagnóstico del problema planteado por el cliente, análisis del estado del arte, definiciones de objetivos, planificación, tecnologías propuestas y metodologías de trabajo.  De esta forma, se busca establecer una base para el posterior desarrollo del proyecto, asegurando una comprensión clara de los requerimientos y la propuesta de solución que será implementada en las siguientes etapas.</w:t>
       </w:r>
     </w:p>
     <w:p>
@@ -1808,7 +1872,7 @@
         <w:widowControl w:val="0"/>
         <w:numPr>
           <w:ilvl w:val="0"/>
-          <w:numId w:val="10"/>
+          <w:numId w:val="2"/>
         </w:numPr>
         <w:pBdr>
           <w:top w:space="0" w:sz="0" w:val="nil"/>
@@ -1967,7 +2031,7 @@
         <w:widowControl w:val="0"/>
         <w:numPr>
           <w:ilvl w:val="0"/>
-          <w:numId w:val="10"/>
+          <w:numId w:val="2"/>
         </w:numPr>
         <w:pBdr>
           <w:top w:space="0" w:sz="0" w:val="nil"/>
@@ -2048,7 +2112,7 @@
         <w:widowControl w:val="0"/>
         <w:numPr>
           <w:ilvl w:val="1"/>
-          <w:numId w:val="10"/>
+          <w:numId w:val="2"/>
         </w:numPr>
         <w:pBdr>
           <w:top w:space="0" w:sz="0" w:val="nil"/>
@@ -2105,7 +2169,7 @@
         <w:widowControl w:val="0"/>
         <w:numPr>
           <w:ilvl w:val="1"/>
-          <w:numId w:val="10"/>
+          <w:numId w:val="2"/>
         </w:numPr>
         <w:pBdr>
           <w:top w:space="0" w:sz="0" w:val="nil"/>
@@ -2162,7 +2226,7 @@
         <w:widowControl w:val="0"/>
         <w:numPr>
           <w:ilvl w:val="1"/>
-          <w:numId w:val="10"/>
+          <w:numId w:val="2"/>
         </w:numPr>
         <w:pBdr>
           <w:top w:space="0" w:sz="0" w:val="nil"/>
@@ -2219,7 +2283,7 @@
         <w:widowControl w:val="0"/>
         <w:numPr>
           <w:ilvl w:val="1"/>
-          <w:numId w:val="10"/>
+          <w:numId w:val="2"/>
         </w:numPr>
         <w:pBdr>
           <w:top w:space="0" w:sz="0" w:val="nil"/>
@@ -4289,7 +4353,7 @@
         <w:widowControl w:val="0"/>
         <w:numPr>
           <w:ilvl w:val="0"/>
-          <w:numId w:val="4"/>
+          <w:numId w:val="6"/>
         </w:numPr>
         <w:ind w:left="720" w:hanging="360"/>
         <w:jc w:val="both"/>
@@ -4326,7 +4390,7 @@
         <w:widowControl w:val="0"/>
         <w:numPr>
           <w:ilvl w:val="0"/>
-          <w:numId w:val="4"/>
+          <w:numId w:val="6"/>
         </w:numPr>
         <w:ind w:left="720" w:hanging="360"/>
         <w:jc w:val="both"/>
@@ -4523,7 +4587,7 @@
         <w:widowControl w:val="0"/>
         <w:numPr>
           <w:ilvl w:val="0"/>
-          <w:numId w:val="5"/>
+          <w:numId w:val="7"/>
         </w:numPr>
         <w:spacing w:before="240" w:lineRule="auto"/>
         <w:ind w:left="720" w:hanging="360"/>
@@ -4586,7 +4650,7 @@
         <w:widowControl w:val="0"/>
         <w:numPr>
           <w:ilvl w:val="0"/>
-          <w:numId w:val="5"/>
+          <w:numId w:val="7"/>
         </w:numPr>
         <w:spacing w:after="240" w:lineRule="auto"/>
         <w:ind w:left="720" w:hanging="360"/>
@@ -4658,7 +4722,7 @@
         <w:widowControl w:val="0"/>
         <w:numPr>
           <w:ilvl w:val="0"/>
-          <w:numId w:val="9"/>
+          <w:numId w:val="11"/>
         </w:numPr>
         <w:spacing w:before="240" w:lineRule="auto"/>
         <w:ind w:left="720" w:hanging="360"/>
@@ -4680,7 +4744,7 @@
         <w:widowControl w:val="0"/>
         <w:numPr>
           <w:ilvl w:val="0"/>
-          <w:numId w:val="9"/>
+          <w:numId w:val="11"/>
         </w:numPr>
         <w:ind w:left="720" w:hanging="360"/>
         <w:jc w:val="both"/>
@@ -4694,461 +4758,6 @@
           <w:rtl w:val="0"/>
         </w:rPr>
         <w:t xml:space="preserve">Informe de Evaluación de Resultados: Documento técnico que detalle el desempeño del algoritmo comparado con otras librerías estándar del mercado.</w:t>
-      </w:r>
-    </w:p>
-    <w:p>
-      <w:pPr>
-        <w:widowControl w:val="0"/>
-        <w:numPr>
-          <w:ilvl w:val="0"/>
-          <w:numId w:val="9"/>
-        </w:numPr>
-        <w:spacing w:after="240" w:lineRule="auto"/>
-        <w:ind w:left="720" w:hanging="360"/>
-        <w:jc w:val="both"/>
-        <w:rPr>
-          <w:rFonts w:ascii="Calibri" w:cs="Calibri" w:eastAsia="Calibri" w:hAnsi="Calibri"/>
-        </w:rPr>
-      </w:pPr>
-      <w:r>
-        <w:rPr>
-          <w:rFonts w:ascii="Calibri" w:cs="Calibri" w:eastAsia="Calibri" w:hAnsi="Calibri"/>
-          <w:rtl w:val="0"/>
-        </w:rPr>
-        <w:t xml:space="preserve">Análisis de Esquema de Modelamiento</w:t>
-      </w:r>
-      <w:r>
-        <w:rPr>
-          <w:rFonts w:ascii="Calibri" w:cs="Calibri" w:eastAsia="Calibri" w:hAnsi="Calibri"/>
-          <w:b w:val="1"/>
-          <w:bCs w:val="1"/>
-          <w:rtl w:val="0"/>
-        </w:rPr>
-        <w:t xml:space="preserve">:</w:t>
-      </w:r>
-      <w:r>
-        <w:rPr>
-          <w:rFonts w:ascii="Calibri" w:cs="Calibri" w:eastAsia="Calibri" w:hAnsi="Calibri"/>
-          <w:rtl w:val="0"/>
-        </w:rPr>
-        <w:t xml:space="preserve"> Documentación detallada sobre las fortalezas y debilidades de la arquitectura lógica propuesta.</w:t>
-      </w:r>
-    </w:p>
-    <w:p>
-      <w:pPr>
-        <w:pStyle w:val="Heading2"/>
-        <w:spacing w:after="0" w:before="0" w:lineRule="auto"/>
-        <w:jc w:val="both"/>
-        <w:rPr>
-          <w:rFonts w:ascii="Calibri" w:cs="Calibri" w:eastAsia="Calibri" w:hAnsi="Calibri"/>
-          <w:b w:val="1"/>
-          <w:bCs w:val="1"/>
-        </w:rPr>
-      </w:pPr>
-      <w:bookmarkStart w:colFirst="0" w:colLast="0" w:name="_heading=h.vx9fgsqx5dab" w:id="15"/>
-      <w:bookmarkEnd w:id="15"/>
-      <w:r>
-        <w:rPr>
-          <w:rFonts w:ascii="Calibri" w:cs="Calibri" w:eastAsia="Calibri" w:hAnsi="Calibri"/>
-          <w:b w:val="1"/>
-          <w:bCs w:val="1"/>
-          <w:sz w:val="22"/>
-          <w:szCs w:val="22"/>
-          <w:rtl w:val="0"/>
-        </w:rPr>
-        <w:t xml:space="preserve">4.3 Supuestos y Restricciones</w:t>
-      </w:r>
-      <w:r>
-        <w:rPr>
-          <w:rtl w:val="0"/>
-        </w:rPr>
-      </w:r>
-    </w:p>
-    <w:p>
-      <w:pPr>
-        <w:widowControl w:val="0"/>
-        <w:numPr>
-          <w:ilvl w:val="0"/>
-          <w:numId w:val="8"/>
-        </w:numPr>
-        <w:spacing w:before="240" w:lineRule="auto"/>
-        <w:ind w:left="720" w:hanging="360"/>
-        <w:jc w:val="both"/>
-        <w:rPr>
-          <w:rFonts w:ascii="Calibri" w:cs="Calibri" w:eastAsia="Calibri" w:hAnsi="Calibri"/>
-        </w:rPr>
-      </w:pPr>
-      <w:r>
-        <w:rPr>
-          <w:rFonts w:ascii="Calibri" w:cs="Calibri" w:eastAsia="Calibri" w:hAnsi="Calibri"/>
-          <w:rtl w:val="0"/>
-        </w:rPr>
-        <w:t xml:space="preserve">Supuestos:</w:t>
-      </w:r>
-    </w:p>
-    <w:p>
-      <w:pPr>
-        <w:widowControl w:val="0"/>
-        <w:numPr>
-          <w:ilvl w:val="1"/>
-          <w:numId w:val="3"/>
-        </w:numPr>
-        <w:ind w:left="1440" w:hanging="360"/>
-        <w:jc w:val="both"/>
-        <w:rPr>
-          <w:rFonts w:ascii="Calibri" w:cs="Calibri" w:eastAsia="Calibri" w:hAnsi="Calibri"/>
-        </w:rPr>
-      </w:pPr>
-      <w:r>
-        <w:rPr>
-          <w:rFonts w:ascii="Calibri" w:cs="Calibri" w:eastAsia="Calibri" w:hAnsi="Calibri"/>
-          <w:rtl w:val="0"/>
-        </w:rPr>
-        <w:t xml:space="preserve">Se asume que la empresa Formulisa proporcionará los conjuntos de datos históricos necesarios y el flujo lógico base para las pruebas en los plazos acordados.</w:t>
-      </w:r>
-    </w:p>
-    <w:p>
-      <w:pPr>
-        <w:widowControl w:val="0"/>
-        <w:numPr>
-          <w:ilvl w:val="1"/>
-          <w:numId w:val="3"/>
-        </w:numPr>
-        <w:ind w:left="1440" w:hanging="360"/>
-        <w:jc w:val="both"/>
-        <w:rPr>
-          <w:rFonts w:ascii="Calibri" w:cs="Calibri" w:eastAsia="Calibri" w:hAnsi="Calibri"/>
-        </w:rPr>
-      </w:pPr>
-      <w:r>
-        <w:rPr>
-          <w:rFonts w:ascii="Calibri" w:cs="Calibri" w:eastAsia="Calibri" w:hAnsi="Calibri"/>
-          <w:rtl w:val="0"/>
-        </w:rPr>
-        <w:t xml:space="preserve">Dado que Formulisa es experta en Big Data, se asume que los volúmenes de datos entregados son representativos del problema de alta variabilidad planteado.</w:t>
-      </w:r>
-    </w:p>
-    <w:p>
-      <w:pPr>
-        <w:widowControl w:val="0"/>
-        <w:numPr>
-          <w:ilvl w:val="1"/>
-          <w:numId w:val="3"/>
-        </w:numPr>
-        <w:ind w:left="1440" w:hanging="360"/>
-        <w:jc w:val="both"/>
-        <w:rPr>
-          <w:rFonts w:ascii="Calibri" w:cs="Calibri" w:eastAsia="Calibri" w:hAnsi="Calibri"/>
-        </w:rPr>
-      </w:pPr>
-      <w:r>
-        <w:rPr>
-          <w:rFonts w:ascii="Calibri" w:cs="Calibri" w:eastAsia="Calibri" w:hAnsi="Calibri"/>
-          <w:rtl w:val="0"/>
-        </w:rPr>
-        <w:t xml:space="preserve">Se considera que no existen conflictos legales respecto a la Ley de Protección de Datos Personales, ya que el cliente garantiza la propiedad y seguridad de la información entregada.</w:t>
-      </w:r>
-    </w:p>
-    <w:p>
-      <w:pPr>
-        <w:widowControl w:val="0"/>
-        <w:numPr>
-          <w:ilvl w:val="0"/>
-          <w:numId w:val="2"/>
-        </w:numPr>
-        <w:ind w:left="720" w:hanging="360"/>
-        <w:jc w:val="both"/>
-        <w:rPr>
-          <w:rFonts w:ascii="Calibri" w:cs="Calibri" w:eastAsia="Calibri" w:hAnsi="Calibri"/>
-        </w:rPr>
-      </w:pPr>
-      <w:r>
-        <w:rPr>
-          <w:rFonts w:ascii="Calibri" w:cs="Calibri" w:eastAsia="Calibri" w:hAnsi="Calibri"/>
-          <w:rtl w:val="0"/>
-        </w:rPr>
-        <w:t xml:space="preserve">Restricciones</w:t>
-      </w:r>
-      <w:r>
-        <w:rPr>
-          <w:rFonts w:ascii="Calibri" w:cs="Calibri" w:eastAsia="Calibri" w:hAnsi="Calibri"/>
-          <w:b w:val="1"/>
-          <w:bCs w:val="1"/>
-          <w:rtl w:val="0"/>
-        </w:rPr>
-        <w:t xml:space="preserve">:</w:t>
-      </w:r>
-      <w:r>
-        <w:rPr>
-          <w:rtl w:val="0"/>
-        </w:rPr>
-      </w:r>
-    </w:p>
-    <w:p>
-      <w:pPr>
-        <w:widowControl w:val="0"/>
-        <w:numPr>
-          <w:ilvl w:val="1"/>
-          <w:numId w:val="3"/>
-        </w:numPr>
-        <w:ind w:left="1440" w:hanging="360"/>
-        <w:jc w:val="both"/>
-        <w:rPr>
-          <w:rFonts w:ascii="Calibri" w:cs="Calibri" w:eastAsia="Calibri" w:hAnsi="Calibri"/>
-        </w:rPr>
-      </w:pPr>
-      <w:r>
-        <w:rPr>
-          <w:rFonts w:ascii="Calibri" w:cs="Calibri" w:eastAsia="Calibri" w:hAnsi="Calibri"/>
-          <w:rtl w:val="0"/>
-        </w:rPr>
-        <w:t xml:space="preserve">Tecnológicas</w:t>
-      </w:r>
-      <w:r>
-        <w:rPr>
-          <w:rFonts w:ascii="Calibri" w:cs="Calibri" w:eastAsia="Calibri" w:hAnsi="Calibri"/>
-          <w:b w:val="1"/>
-          <w:bCs w:val="1"/>
-          <w:rtl w:val="0"/>
-        </w:rPr>
-        <w:t xml:space="preserve">:</w:t>
-      </w:r>
-      <w:r>
-        <w:rPr>
-          <w:rFonts w:ascii="Calibri" w:cs="Calibri" w:eastAsia="Calibri" w:hAnsi="Calibri"/>
-          <w:rtl w:val="0"/>
-        </w:rPr>
-        <w:t xml:space="preserve"> La solución debe desarrollarse obligatoriamente en lenguaje Python, utilizando librerías de alto rendimiento como NumPy, Pandas y Scikit-learn.</w:t>
-      </w:r>
-    </w:p>
-    <w:p>
-      <w:pPr>
-        <w:widowControl w:val="0"/>
-        <w:numPr>
-          <w:ilvl w:val="1"/>
-          <w:numId w:val="3"/>
-        </w:numPr>
-        <w:ind w:left="1440" w:hanging="360"/>
-        <w:jc w:val="both"/>
-        <w:rPr>
-          <w:rFonts w:ascii="Calibri" w:cs="Calibri" w:eastAsia="Calibri" w:hAnsi="Calibri"/>
-        </w:rPr>
-      </w:pPr>
-      <w:r>
-        <w:rPr>
-          <w:rFonts w:ascii="Calibri" w:cs="Calibri" w:eastAsia="Calibri" w:hAnsi="Calibri"/>
-          <w:rtl w:val="0"/>
-        </w:rPr>
-        <w:t xml:space="preserve">Infraestructura: La</w:t>
-      </w:r>
-      <w:r>
-        <w:rPr>
-          <w:rFonts w:ascii="Calibri" w:cs="Calibri" w:eastAsia="Calibri" w:hAnsi="Calibri"/>
-          <w:b w:val="1"/>
-          <w:bCs w:val="1"/>
-          <w:rtl w:val="0"/>
-        </w:rPr>
-        <w:t xml:space="preserve"> </w:t>
-      </w:r>
-      <w:r>
-        <w:rPr>
-          <w:rFonts w:ascii="Calibri" w:cs="Calibri" w:eastAsia="Calibri" w:hAnsi="Calibri"/>
-          <w:rtl w:val="0"/>
-        </w:rPr>
-        <w:t xml:space="preserve">ejecución base es local</w:t>
-      </w:r>
-    </w:p>
-    <w:p>
-      <w:pPr>
-        <w:widowControl w:val="0"/>
-        <w:numPr>
-          <w:ilvl w:val="1"/>
-          <w:numId w:val="3"/>
-        </w:numPr>
-        <w:spacing w:after="240" w:lineRule="auto"/>
-        <w:ind w:left="1440" w:hanging="360"/>
-        <w:jc w:val="both"/>
-        <w:rPr>
-          <w:rFonts w:ascii="Calibri" w:cs="Calibri" w:eastAsia="Calibri" w:hAnsi="Calibri"/>
-        </w:rPr>
-      </w:pPr>
-      <w:r>
-        <w:rPr>
-          <w:rFonts w:ascii="Calibri" w:cs="Calibri" w:eastAsia="Calibri" w:hAnsi="Calibri"/>
-          <w:rtl w:val="0"/>
-        </w:rPr>
-        <w:t xml:space="preserve">Temporales y Académicas</w:t>
-      </w:r>
-      <w:r>
-        <w:rPr>
-          <w:rFonts w:ascii="Calibri" w:cs="Calibri" w:eastAsia="Calibri" w:hAnsi="Calibri"/>
-          <w:b w:val="1"/>
-          <w:bCs w:val="1"/>
-          <w:rtl w:val="0"/>
-        </w:rPr>
-        <w:t xml:space="preserve">:</w:t>
-      </w:r>
-      <w:r>
-        <w:rPr>
-          <w:rFonts w:ascii="Calibri" w:cs="Calibri" w:eastAsia="Calibri" w:hAnsi="Calibri"/>
-          <w:rtl w:val="0"/>
-        </w:rPr>
-        <w:t xml:space="preserve"> El desarrollo está sujeto al calendario académico de la asignatura, cumpliendo con los hitos de evaluación definidos por la institución.</w:t>
-      </w:r>
-    </w:p>
-    <w:p>
-      <w:pPr>
-        <w:widowControl w:val="0"/>
-        <w:jc w:val="both"/>
-        <w:rPr>
-          <w:rFonts w:ascii="Calibri" w:cs="Calibri" w:eastAsia="Calibri" w:hAnsi="Calibri"/>
-        </w:rPr>
-      </w:pPr>
-      <w:r>
-        <w:rPr>
-          <w:rtl w:val="0"/>
-        </w:rPr>
-      </w:r>
-    </w:p>
-    <w:p>
-      <w:pPr>
-        <w:widowControl w:val="0"/>
-        <w:jc w:val="both"/>
-        <w:rPr>
-          <w:rFonts w:ascii="Calibri" w:cs="Calibri" w:eastAsia="Calibri" w:hAnsi="Calibri"/>
-        </w:rPr>
-      </w:pPr>
-      <w:r>
-        <w:rPr>
-          <w:rFonts w:ascii="Calibri" w:cs="Calibri" w:eastAsia="Calibri" w:hAnsi="Calibri"/>
-          <w:rtl w:val="0"/>
-        </w:rPr>
-        <w:t xml:space="preserve">Adicionalmente, el cliente ha definido que el algoritmo desarrollado será comparado con los modelos actualmente utilizados en la empresa, con el objetivo de evaluar su rendimiento relativo. En este sentido, no se establece como requisito obligatorio superar el desempeño de los modelos existentes; sin embargo, se considera satisfactorio que el algoritmo propuesto logre mejoras, incluso marginales, en los resultados obtenidos. En este sentido, el cliente ha señalado que una mejora de al menos un 0,1% en el rendimiento del modelo sería considerada un resultado exitoso.</w:t>
-      </w:r>
-    </w:p>
-    <w:p>
-      <w:pPr>
-        <w:widowControl w:val="0"/>
-        <w:jc w:val="both"/>
-        <w:rPr>
-          <w:rFonts w:ascii="Calibri" w:cs="Calibri" w:eastAsia="Calibri" w:hAnsi="Calibri"/>
-        </w:rPr>
-      </w:pPr>
-      <w:r>
-        <w:rPr>
-          <w:rtl w:val="0"/>
-        </w:rPr>
-      </w:r>
-    </w:p>
-    <w:p>
-      <w:pPr>
-        <w:pStyle w:val="Heading1"/>
-        <w:jc w:val="both"/>
-        <w:rPr>
-          <w:rFonts w:ascii="Calibri" w:cs="Calibri" w:eastAsia="Calibri" w:hAnsi="Calibri"/>
-        </w:rPr>
-      </w:pPr>
-      <w:bookmarkStart w:colFirst="0" w:colLast="0" w:name="_heading=h.dw6ffonpwbzc" w:id="16"/>
-      <w:bookmarkEnd w:id="16"/>
-      <w:r>
-        <w:rPr>
-          <w:rFonts w:ascii="Calibri" w:cs="Calibri" w:eastAsia="Calibri" w:hAnsi="Calibri"/>
-          <w:rtl w:val="0"/>
-        </w:rPr>
-        <w:t xml:space="preserve">5. Planificación</w:t>
-      </w:r>
-    </w:p>
-    <w:p>
-      <w:pPr>
-        <w:widowControl w:val="0"/>
-        <w:jc w:val="both"/>
-        <w:rPr>
-          <w:rFonts w:ascii="Calibri" w:cs="Calibri" w:eastAsia="Calibri" w:hAnsi="Calibri"/>
-        </w:rPr>
-      </w:pPr>
-      <w:r>
-        <w:rPr>
-          <w:rFonts w:ascii="Calibri" w:cs="Calibri" w:eastAsia="Calibri" w:hAnsi="Calibri"/>
-          <w:rtl w:val="0"/>
-        </w:rPr>
-        <w:t xml:space="preserve">La planificación del proyecto se articula en torno a un ciclo incremental genérico hacia un modelo de prototipado evolutivo, donde cada fase entrega un componente funcional del algoritmo que es probado y refinado antes de integrar el siguiente.</w:t>
-      </w:r>
-    </w:p>
-    <w:p>
-      <w:pPr>
-        <w:widowControl w:val="0"/>
-        <w:jc w:val="both"/>
-        <w:rPr>
-          <w:rFonts w:ascii="Calibri" w:cs="Calibri" w:eastAsia="Calibri" w:hAnsi="Calibri"/>
-        </w:rPr>
-      </w:pPr>
-      <w:r>
-        <w:rPr>
-          <w:rtl w:val="0"/>
-        </w:rPr>
-      </w:r>
-    </w:p>
-    <w:p>
-      <w:pPr>
-        <w:pStyle w:val="Heading2"/>
-        <w:spacing w:after="0" w:before="0" w:lineRule="auto"/>
-        <w:jc w:val="both"/>
-        <w:rPr>
-          <w:rFonts w:ascii="Calibri" w:cs="Calibri" w:eastAsia="Calibri" w:hAnsi="Calibri"/>
-        </w:rPr>
-      </w:pPr>
-      <w:bookmarkStart w:colFirst="0" w:colLast="0" w:name="_heading=h.90ylfdrbwd66" w:id="17"/>
-      <w:bookmarkEnd w:id="17"/>
-      <w:r>
-        <w:rPr>
-          <w:rFonts w:ascii="Calibri" w:cs="Calibri" w:eastAsia="Calibri" w:hAnsi="Calibri"/>
-          <w:b w:val="1"/>
-          <w:bCs w:val="1"/>
-          <w:sz w:val="22"/>
-          <w:szCs w:val="22"/>
-          <w:rtl w:val="0"/>
-        </w:rPr>
-        <w:t xml:space="preserve">5.1 Estructura de Trabajo</w:t>
-      </w:r>
-      <w:r>
-        <w:rPr>
-          <w:rtl w:val="0"/>
-        </w:rPr>
-      </w:r>
-    </w:p>
-    <w:p>
-      <w:pPr>
-        <w:widowControl w:val="0"/>
-        <w:spacing w:after="240" w:before="240" w:lineRule="auto"/>
-        <w:jc w:val="both"/>
-        <w:rPr>
-          <w:rFonts w:ascii="Calibri" w:cs="Calibri" w:eastAsia="Calibri" w:hAnsi="Calibri"/>
-        </w:rPr>
-      </w:pPr>
-      <w:r>
-        <w:rPr>
-          <w:rFonts w:ascii="Calibri" w:cs="Calibri" w:eastAsia="Calibri" w:hAnsi="Calibri"/>
-          <w:rtl w:val="0"/>
-        </w:rPr>
-        <w:t xml:space="preserve">La ejecución del proyecto se divide en tres fases principales:</w:t>
-      </w:r>
-    </w:p>
-    <w:p>
-      <w:pPr>
-        <w:widowControl w:val="0"/>
-        <w:spacing w:after="240" w:lineRule="auto"/>
-        <w:ind w:left="0" w:firstLine="0"/>
-        <w:jc w:val="both"/>
-        <w:rPr>
-          <w:rFonts w:ascii="Calibri" w:cs="Calibri" w:eastAsia="Calibri" w:hAnsi="Calibri"/>
-        </w:rPr>
-      </w:pPr>
-      <w:r>
-        <w:rPr>
-          <w:rFonts w:ascii="Calibri" w:cs="Calibri" w:eastAsia="Calibri" w:hAnsi="Calibri"/>
-          <w:rtl w:val="0"/>
-        </w:rPr>
-        <w:t xml:space="preserve">Fase I: Definición y Diseño Funcional (Semanas 1 - 4)</w:t>
       </w:r>
     </w:p>
     <w:p>
@@ -5170,7 +4779,53 @@
           <w:rFonts w:ascii="Calibri" w:cs="Calibri" w:eastAsia="Calibri" w:hAnsi="Calibri"/>
           <w:rtl w:val="0"/>
         </w:rPr>
-        <w:t xml:space="preserve">Diagnóstico: Levantamiento de contexto, requerimientos técnicos y definición de la oportunidad de negocio con Formulisa.  </w:t>
+        <w:t xml:space="preserve">Análisis de Esquema de Modelamiento</w:t>
+      </w:r>
+      <w:r>
+        <w:rPr>
+          <w:rFonts w:ascii="Calibri" w:cs="Calibri" w:eastAsia="Calibri" w:hAnsi="Calibri"/>
+          <w:b w:val="1"/>
+          <w:bCs w:val="1"/>
+          <w:rtl w:val="0"/>
+        </w:rPr>
+        <w:t xml:space="preserve">:</w:t>
+      </w:r>
+      <w:r>
+        <w:rPr>
+          <w:rFonts w:ascii="Calibri" w:cs="Calibri" w:eastAsia="Calibri" w:hAnsi="Calibri"/>
+          <w:rtl w:val="0"/>
+        </w:rPr>
+        <w:t xml:space="preserve"> Documentación detallada sobre las fortalezas y debilidades de la arquitectura lógica propuesta.</w:t>
+      </w:r>
+    </w:p>
+    <w:p>
+      <w:pPr>
+        <w:pStyle w:val="Heading2"/>
+        <w:spacing w:after="0" w:before="0" w:lineRule="auto"/>
+        <w:jc w:val="both"/>
+        <w:rPr>
+          <w:rFonts w:ascii="Calibri" w:cs="Calibri" w:eastAsia="Calibri" w:hAnsi="Calibri"/>
+          <w:b w:val="1"/>
+          <w:bCs w:val="1"/>
+        </w:rPr>
+      </w:pPr>
+      <w:bookmarkStart w:colFirst="0" w:colLast="0" w:name="_heading=h.vx9fgsqx5dab" w:id="15"/>
+      <w:bookmarkEnd w:id="15"/>
+      <w:r>
+        <w:rPr>
+          <w:rFonts w:ascii="Calibri" w:cs="Calibri" w:eastAsia="Calibri" w:hAnsi="Calibri"/>
+          <w:b w:val="1"/>
+          <w:bCs w:val="1"/>
+          <w:sz w:val="22"/>
+          <w:szCs w:val="22"/>
+          <w:rtl w:val="0"/>
+        </w:rPr>
+        <w:t xml:space="preserve">4.3 Supuestos y Restricciones</w:t>
+      </w:r>
+      <w:r>
+        <w:rPr>
+          <w:rtl w:val="0"/>
+        </w:rPr>
       </w:r>
     </w:p>
     <w:p>
@@ -5178,7 +4833,394 @@
         <w:widowControl w:val="0"/>
         <w:numPr>
           <w:ilvl w:val="0"/>
-          <w:numId w:val="11"/>
+          <w:numId w:val="10"/>
+        </w:numPr>
+        <w:spacing w:before="240" w:lineRule="auto"/>
+        <w:ind w:left="720" w:hanging="360"/>
+        <w:jc w:val="both"/>
+        <w:rPr>
+          <w:rFonts w:ascii="Calibri" w:cs="Calibri" w:eastAsia="Calibri" w:hAnsi="Calibri"/>
+        </w:rPr>
+      </w:pPr>
+      <w:r>
+        <w:rPr>
+          <w:rFonts w:ascii="Calibri" w:cs="Calibri" w:eastAsia="Calibri" w:hAnsi="Calibri"/>
+          <w:rtl w:val="0"/>
+        </w:rPr>
+        <w:t xml:space="preserve">Supuestos:</w:t>
+      </w:r>
+    </w:p>
+    <w:p>
+      <w:pPr>
+        <w:widowControl w:val="0"/>
+        <w:numPr>
+          <w:ilvl w:val="1"/>
+          <w:numId w:val="5"/>
+        </w:numPr>
+        <w:ind w:left="1440" w:hanging="360"/>
+        <w:jc w:val="both"/>
+        <w:rPr>
+          <w:rFonts w:ascii="Calibri" w:cs="Calibri" w:eastAsia="Calibri" w:hAnsi="Calibri"/>
+        </w:rPr>
+      </w:pPr>
+      <w:r>
+        <w:rPr>
+          <w:rFonts w:ascii="Calibri" w:cs="Calibri" w:eastAsia="Calibri" w:hAnsi="Calibri"/>
+          <w:rtl w:val="0"/>
+        </w:rPr>
+        <w:t xml:space="preserve">Se asume que la empresa Formulisa proporcionará los conjuntos de datos históricos necesarios y el flujo lógico base para las pruebas en los plazos acordados.</w:t>
+      </w:r>
+    </w:p>
+    <w:p>
+      <w:pPr>
+        <w:widowControl w:val="0"/>
+        <w:numPr>
+          <w:ilvl w:val="1"/>
+          <w:numId w:val="5"/>
+        </w:numPr>
+        <w:ind w:left="1440" w:hanging="360"/>
+        <w:jc w:val="both"/>
+        <w:rPr>
+          <w:rFonts w:ascii="Calibri" w:cs="Calibri" w:eastAsia="Calibri" w:hAnsi="Calibri"/>
+        </w:rPr>
+      </w:pPr>
+      <w:r>
+        <w:rPr>
+          <w:rFonts w:ascii="Calibri" w:cs="Calibri" w:eastAsia="Calibri" w:hAnsi="Calibri"/>
+          <w:rtl w:val="0"/>
+        </w:rPr>
+        <w:t xml:space="preserve">Dado que Formulisa es experta en Big Data, se asume que los volúmenes de datos entregados son representativos del problema de alta variabilidad planteado.</w:t>
+      </w:r>
+    </w:p>
+    <w:p>
+      <w:pPr>
+        <w:widowControl w:val="0"/>
+        <w:numPr>
+          <w:ilvl w:val="1"/>
+          <w:numId w:val="5"/>
+        </w:numPr>
+        <w:ind w:left="1440" w:hanging="360"/>
+        <w:jc w:val="both"/>
+        <w:rPr>
+          <w:rFonts w:ascii="Calibri" w:cs="Calibri" w:eastAsia="Calibri" w:hAnsi="Calibri"/>
+        </w:rPr>
+      </w:pPr>
+      <w:r>
+        <w:rPr>
+          <w:rFonts w:ascii="Calibri" w:cs="Calibri" w:eastAsia="Calibri" w:hAnsi="Calibri"/>
+          <w:rtl w:val="0"/>
+        </w:rPr>
+        <w:t xml:space="preserve">Se considera que no existen conflictos legales respecto a la Ley de Protección de Datos Personales, ya que el cliente garantiza la propiedad y seguridad de la información entregada.</w:t>
+      </w:r>
+    </w:p>
+    <w:p>
+      <w:pPr>
+        <w:widowControl w:val="0"/>
+        <w:numPr>
+          <w:ilvl w:val="0"/>
+          <w:numId w:val="4"/>
+        </w:numPr>
+        <w:ind w:left="720" w:hanging="360"/>
+        <w:jc w:val="both"/>
+        <w:rPr>
+          <w:rFonts w:ascii="Calibri" w:cs="Calibri" w:eastAsia="Calibri" w:hAnsi="Calibri"/>
+        </w:rPr>
+      </w:pPr>
+      <w:r>
+        <w:rPr>
+          <w:rFonts w:ascii="Calibri" w:cs="Calibri" w:eastAsia="Calibri" w:hAnsi="Calibri"/>
+          <w:rtl w:val="0"/>
+        </w:rPr>
+        <w:t xml:space="preserve">Restricciones</w:t>
+      </w:r>
+      <w:r>
+        <w:rPr>
+          <w:rFonts w:ascii="Calibri" w:cs="Calibri" w:eastAsia="Calibri" w:hAnsi="Calibri"/>
+          <w:b w:val="1"/>
+          <w:bCs w:val="1"/>
+          <w:rtl w:val="0"/>
+        </w:rPr>
+        <w:t xml:space="preserve">:</w:t>
+      </w:r>
+      <w:r>
+        <w:rPr>
+          <w:rtl w:val="0"/>
+        </w:rPr>
+      </w:r>
+    </w:p>
+    <w:p>
+      <w:pPr>
+        <w:widowControl w:val="0"/>
+        <w:numPr>
+          <w:ilvl w:val="1"/>
+          <w:numId w:val="5"/>
+        </w:numPr>
+        <w:ind w:left="1440" w:hanging="360"/>
+        <w:jc w:val="both"/>
+        <w:rPr>
+          <w:rFonts w:ascii="Calibri" w:cs="Calibri" w:eastAsia="Calibri" w:hAnsi="Calibri"/>
+        </w:rPr>
+      </w:pPr>
+      <w:r>
+        <w:rPr>
+          <w:rFonts w:ascii="Calibri" w:cs="Calibri" w:eastAsia="Calibri" w:hAnsi="Calibri"/>
+          <w:rtl w:val="0"/>
+        </w:rPr>
+        <w:t xml:space="preserve">Tecnológicas</w:t>
+      </w:r>
+      <w:r>
+        <w:rPr>
+          <w:rFonts w:ascii="Calibri" w:cs="Calibri" w:eastAsia="Calibri" w:hAnsi="Calibri"/>
+          <w:b w:val="1"/>
+          <w:bCs w:val="1"/>
+          <w:rtl w:val="0"/>
+        </w:rPr>
+        <w:t xml:space="preserve">:</w:t>
+      </w:r>
+      <w:r>
+        <w:rPr>
+          <w:rFonts w:ascii="Calibri" w:cs="Calibri" w:eastAsia="Calibri" w:hAnsi="Calibri"/>
+          <w:rtl w:val="0"/>
+        </w:rPr>
+        <w:t xml:space="preserve"> La solución debe desarrollarse obligatoriamente en lenguaje Python, utilizando librerías de alto rendimiento como NumPy, Pandas y Scikit-learn.</w:t>
+      </w:r>
+    </w:p>
+    <w:p>
+      <w:pPr>
+        <w:widowControl w:val="0"/>
+        <w:numPr>
+          <w:ilvl w:val="1"/>
+          <w:numId w:val="5"/>
+        </w:numPr>
+        <w:ind w:left="1440" w:hanging="360"/>
+        <w:jc w:val="both"/>
+        <w:rPr>
+          <w:rFonts w:ascii="Calibri" w:cs="Calibri" w:eastAsia="Calibri" w:hAnsi="Calibri"/>
+        </w:rPr>
+      </w:pPr>
+      <w:r>
+        <w:rPr>
+          <w:rFonts w:ascii="Calibri" w:cs="Calibri" w:eastAsia="Calibri" w:hAnsi="Calibri"/>
+          <w:rtl w:val="0"/>
+        </w:rPr>
+        <w:t xml:space="preserve">Infraestructura: La</w:t>
+      </w:r>
+      <w:r>
+        <w:rPr>
+          <w:rFonts w:ascii="Calibri" w:cs="Calibri" w:eastAsia="Calibri" w:hAnsi="Calibri"/>
+          <w:b w:val="1"/>
+          <w:bCs w:val="1"/>
+          <w:rtl w:val="0"/>
+        </w:rPr>
+        <w:t xml:space="preserve"> </w:t>
+      </w:r>
+      <w:r>
+        <w:rPr>
+          <w:rFonts w:ascii="Calibri" w:cs="Calibri" w:eastAsia="Calibri" w:hAnsi="Calibri"/>
+          <w:rtl w:val="0"/>
+        </w:rPr>
+        <w:t xml:space="preserve">ejecución base es local en entorno Ubuntu.</w:t>
+      </w:r>
+    </w:p>
+    <w:p>
+      <w:pPr>
+        <w:widowControl w:val="0"/>
+        <w:numPr>
+          <w:ilvl w:val="1"/>
+          <w:numId w:val="5"/>
+        </w:numPr>
+        <w:spacing w:after="240" w:lineRule="auto"/>
+        <w:ind w:left="1440" w:hanging="360"/>
+        <w:jc w:val="both"/>
+        <w:rPr>
+          <w:rFonts w:ascii="Calibri" w:cs="Calibri" w:eastAsia="Calibri" w:hAnsi="Calibri"/>
+        </w:rPr>
+      </w:pPr>
+      <w:r>
+        <w:rPr>
+          <w:rFonts w:ascii="Calibri" w:cs="Calibri" w:eastAsia="Calibri" w:hAnsi="Calibri"/>
+          <w:rtl w:val="0"/>
+        </w:rPr>
+        <w:t xml:space="preserve">Temporales y Académicas</w:t>
+      </w:r>
+      <w:r>
+        <w:rPr>
+          <w:rFonts w:ascii="Calibri" w:cs="Calibri" w:eastAsia="Calibri" w:hAnsi="Calibri"/>
+          <w:b w:val="1"/>
+          <w:bCs w:val="1"/>
+          <w:rtl w:val="0"/>
+        </w:rPr>
+        <w:t xml:space="preserve">:</w:t>
+      </w:r>
+      <w:r>
+        <w:rPr>
+          <w:rFonts w:ascii="Calibri" w:cs="Calibri" w:eastAsia="Calibri" w:hAnsi="Calibri"/>
+          <w:rtl w:val="0"/>
+        </w:rPr>
+        <w:t xml:space="preserve"> El desarrollo está sujeto al calendario académico de la asignatura, cumpliendo con los hitos de evaluación definidos por la institución.</w:t>
+      </w:r>
+    </w:p>
+    <w:p>
+      <w:pPr>
+        <w:widowControl w:val="0"/>
+        <w:jc w:val="both"/>
+        <w:rPr>
+          <w:rFonts w:ascii="Calibri" w:cs="Calibri" w:eastAsia="Calibri" w:hAnsi="Calibri"/>
+        </w:rPr>
+      </w:pPr>
+      <w:r>
+        <w:rPr>
+          <w:rtl w:val="0"/>
+        </w:rPr>
+      </w:r>
+    </w:p>
+    <w:p>
+      <w:pPr>
+        <w:widowControl w:val="0"/>
+        <w:jc w:val="both"/>
+        <w:rPr>
+          <w:rFonts w:ascii="Calibri" w:cs="Calibri" w:eastAsia="Calibri" w:hAnsi="Calibri"/>
+        </w:rPr>
+      </w:pPr>
+      <w:r>
+        <w:rPr>
+          <w:rFonts w:ascii="Calibri" w:cs="Calibri" w:eastAsia="Calibri" w:hAnsi="Calibri"/>
+          <w:rtl w:val="0"/>
+        </w:rPr>
+        <w:t xml:space="preserve">Adicionalmente, el cliente ha definido que el algoritmo desarrollado será comparado con los modelos actualmente utilizados en la empresa, con el objetivo de evaluar su rendimiento relativo. En este sentido, no se establece como requisito obligatorio superar el desempeño de los modelos existentes; sin embargo, se considera satisfactorio que el algoritmo propuesto logre mejoras, incluso marginales, en los resultados obtenidos. En este sentido, el cliente ha señalado que una mejora de al menos un 0,1% en el rendimiento del modelo sería considerada un resultado exitoso.</w:t>
+      </w:r>
+    </w:p>
+    <w:p>
+      <w:pPr>
+        <w:widowControl w:val="0"/>
+        <w:jc w:val="both"/>
+        <w:rPr>
+          <w:rFonts w:ascii="Calibri" w:cs="Calibri" w:eastAsia="Calibri" w:hAnsi="Calibri"/>
+        </w:rPr>
+      </w:pPr>
+      <w:r>
+        <w:rPr>
+          <w:rtl w:val="0"/>
+        </w:rPr>
+      </w:r>
+    </w:p>
+    <w:p>
+      <w:pPr>
+        <w:pStyle w:val="Heading1"/>
+        <w:jc w:val="both"/>
+        <w:rPr>
+          <w:rFonts w:ascii="Calibri" w:cs="Calibri" w:eastAsia="Calibri" w:hAnsi="Calibri"/>
+        </w:rPr>
+      </w:pPr>
+      <w:bookmarkStart w:colFirst="0" w:colLast="0" w:name="_heading=h.dw6ffonpwbzc" w:id="16"/>
+      <w:bookmarkEnd w:id="16"/>
+      <w:r>
+        <w:rPr>
+          <w:rFonts w:ascii="Calibri" w:cs="Calibri" w:eastAsia="Calibri" w:hAnsi="Calibri"/>
+          <w:rtl w:val="0"/>
+        </w:rPr>
+        <w:t xml:space="preserve">5. Planificación</w:t>
+      </w:r>
+    </w:p>
+    <w:p>
+      <w:pPr>
+        <w:widowControl w:val="0"/>
+        <w:jc w:val="both"/>
+        <w:rPr>
+          <w:rFonts w:ascii="Calibri" w:cs="Calibri" w:eastAsia="Calibri" w:hAnsi="Calibri"/>
+        </w:rPr>
+      </w:pPr>
+      <w:r>
+        <w:rPr>
+          <w:rFonts w:ascii="Calibri" w:cs="Calibri" w:eastAsia="Calibri" w:hAnsi="Calibri"/>
+          <w:rtl w:val="0"/>
+        </w:rPr>
+        <w:t xml:space="preserve">La planificación del proyecto se articula en torno a un ciclo incremental genérico hacia un modelo de prototipado evolutivo, donde cada fase entrega un componente funcional del algoritmo que es probado y refinado antes de integrar el siguiente.</w:t>
+      </w:r>
+    </w:p>
+    <w:p>
+      <w:pPr>
+        <w:widowControl w:val="0"/>
+        <w:jc w:val="both"/>
+        <w:rPr>
+          <w:rFonts w:ascii="Calibri" w:cs="Calibri" w:eastAsia="Calibri" w:hAnsi="Calibri"/>
+        </w:rPr>
+      </w:pPr>
+      <w:r>
+        <w:rPr>
+          <w:rtl w:val="0"/>
+        </w:rPr>
+      </w:r>
+    </w:p>
+    <w:p>
+      <w:pPr>
+        <w:pStyle w:val="Heading2"/>
+        <w:spacing w:after="0" w:before="0" w:lineRule="auto"/>
+        <w:jc w:val="both"/>
+        <w:rPr>
+          <w:rFonts w:ascii="Calibri" w:cs="Calibri" w:eastAsia="Calibri" w:hAnsi="Calibri"/>
+        </w:rPr>
+      </w:pPr>
+      <w:bookmarkStart w:colFirst="0" w:colLast="0" w:name="_heading=h.90ylfdrbwd66" w:id="17"/>
+      <w:bookmarkEnd w:id="17"/>
+      <w:r>
+        <w:rPr>
+          <w:rFonts w:ascii="Calibri" w:cs="Calibri" w:eastAsia="Calibri" w:hAnsi="Calibri"/>
+          <w:b w:val="1"/>
+          <w:bCs w:val="1"/>
+          <w:sz w:val="22"/>
+          <w:szCs w:val="22"/>
+          <w:rtl w:val="0"/>
+        </w:rPr>
+        <w:t xml:space="preserve">5.1 Estructura de Trabajo</w:t>
+      </w:r>
+      <w:r>
+        <w:rPr>
+          <w:rtl w:val="0"/>
+        </w:rPr>
+      </w:r>
+    </w:p>
+    <w:p>
+      <w:pPr>
+        <w:widowControl w:val="0"/>
+        <w:spacing w:after="240" w:before="240" w:lineRule="auto"/>
+        <w:jc w:val="both"/>
+        <w:rPr>
+          <w:rFonts w:ascii="Calibri" w:cs="Calibri" w:eastAsia="Calibri" w:hAnsi="Calibri"/>
+        </w:rPr>
+      </w:pPr>
+      <w:r>
+        <w:rPr>
+          <w:rFonts w:ascii="Calibri" w:cs="Calibri" w:eastAsia="Calibri" w:hAnsi="Calibri"/>
+          <w:rtl w:val="0"/>
+        </w:rPr>
+        <w:t xml:space="preserve">La ejecución del proyecto se divide en tres fases principales:</w:t>
+      </w:r>
+    </w:p>
+    <w:p>
+      <w:pPr>
+        <w:widowControl w:val="0"/>
+        <w:spacing w:after="240" w:lineRule="auto"/>
+        <w:ind w:left="0" w:firstLine="0"/>
+        <w:jc w:val="both"/>
+        <w:rPr>
+          <w:rFonts w:ascii="Calibri" w:cs="Calibri" w:eastAsia="Calibri" w:hAnsi="Calibri"/>
+        </w:rPr>
+      </w:pPr>
+      <w:r>
+        <w:rPr>
+          <w:rFonts w:ascii="Calibri" w:cs="Calibri" w:eastAsia="Calibri" w:hAnsi="Calibri"/>
+          <w:rtl w:val="0"/>
+        </w:rPr>
+        <w:t xml:space="preserve">Fase I: Definición y Diseño Funcional (Semanas 1 - 4)</w:t>
+      </w:r>
+    </w:p>
+    <w:p>
+      <w:pPr>
+        <w:widowControl w:val="0"/>
+        <w:numPr>
+          <w:ilvl w:val="0"/>
+          <w:numId w:val="3"/>
         </w:numPr>
         <w:spacing w:after="240" w:lineRule="auto"/>
         <w:ind w:left="720" w:hanging="360"/>
@@ -5192,7 +5234,7 @@
           <w:rFonts w:ascii="Calibri" w:cs="Calibri" w:eastAsia="Calibri" w:hAnsi="Calibri"/>
           <w:rtl w:val="0"/>
         </w:rPr>
-        <w:t xml:space="preserve">Investigación: Estudio del estado del arte y selección de herramientas tecnológicas (Python, NumPy, Pandas).  </w:t>
+        <w:t xml:space="preserve">Diagnóstico: Levantamiento de contexto, requerimientos técnicos y definición de la oportunidad de negocio con Formulisa.  </w:t>
       </w:r>
     </w:p>
     <w:p>
@@ -5200,7 +5242,7 @@
         <w:widowControl w:val="0"/>
         <w:numPr>
           <w:ilvl w:val="0"/>
-          <w:numId w:val="11"/>
+          <w:numId w:val="3"/>
         </w:numPr>
         <w:spacing w:after="240" w:lineRule="auto"/>
         <w:ind w:left="720" w:hanging="360"/>
@@ -5214,6 +5256,28 @@
           <w:rFonts w:ascii="Calibri" w:cs="Calibri" w:eastAsia="Calibri" w:hAnsi="Calibri"/>
           <w:rtl w:val="0"/>
         </w:rPr>
+        <w:t xml:space="preserve">Investigación: Estudio del estado del arte y selección de herramientas tecnológicas (Python, NumPy, Pandas).  </w:t>
+      </w:r>
+    </w:p>
+    <w:p>
+      <w:pPr>
+        <w:widowControl w:val="0"/>
+        <w:numPr>
+          <w:ilvl w:val="0"/>
+          <w:numId w:val="3"/>
+        </w:numPr>
+        <w:spacing w:after="240" w:lineRule="auto"/>
+        <w:ind w:left="720" w:hanging="360"/>
+        <w:jc w:val="both"/>
+        <w:rPr>
+          <w:rFonts w:ascii="Calibri" w:cs="Calibri" w:eastAsia="Calibri" w:hAnsi="Calibri"/>
+        </w:rPr>
+      </w:pPr>
+      <w:r>
+        <w:rPr>
+          <w:rFonts w:ascii="Calibri" w:cs="Calibri" w:eastAsia="Calibri" w:hAnsi="Calibri"/>
+          <w:rtl w:val="0"/>
+        </w:rPr>
         <w:t xml:space="preserve">Diseño Lógico: Establecimiento de objetivos, alcance y diseño del algoritmo basado en espacios vectoriales.  </w:t>
       </w:r>
     </w:p>
@@ -5240,7 +5304,7 @@
         <w:widowControl w:val="0"/>
         <w:numPr>
           <w:ilvl w:val="0"/>
-          <w:numId w:val="11"/>
+          <w:numId w:val="3"/>
         </w:numPr>
         <w:spacing w:after="240" w:lineRule="auto"/>
         <w:ind w:left="720" w:hanging="360"/>
@@ -5262,7 +5326,7 @@
         <w:widowControl w:val="0"/>
         <w:numPr>
           <w:ilvl w:val="0"/>
-          <w:numId w:val="11"/>
+          <w:numId w:val="3"/>
         </w:numPr>
         <w:spacing w:after="240" w:lineRule="auto"/>
         <w:ind w:left="720" w:hanging="360"/>
@@ -5284,7 +5348,7 @@
         <w:widowControl w:val="0"/>
         <w:numPr>
           <w:ilvl w:val="0"/>
-          <w:numId w:val="11"/>
+          <w:numId w:val="3"/>
         </w:numPr>
         <w:spacing w:after="240" w:lineRule="auto"/>
         <w:ind w:left="720" w:hanging="360"/>
@@ -5324,7 +5388,7 @@
         <w:widowControl w:val="0"/>
         <w:numPr>
           <w:ilvl w:val="0"/>
-          <w:numId w:val="11"/>
+          <w:numId w:val="3"/>
         </w:numPr>
         <w:spacing w:after="240" w:lineRule="auto"/>
         <w:ind w:left="720" w:hanging="360"/>
@@ -5346,7 +5410,7 @@
         <w:widowControl w:val="0"/>
         <w:numPr>
           <w:ilvl w:val="0"/>
-          <w:numId w:val="11"/>
+          <w:numId w:val="3"/>
         </w:numPr>
         <w:spacing w:after="240" w:lineRule="auto"/>
         <w:ind w:left="720" w:hanging="360"/>
@@ -5368,7 +5432,7 @@
         <w:widowControl w:val="0"/>
         <w:numPr>
           <w:ilvl w:val="0"/>
-          <w:numId w:val="11"/>
+          <w:numId w:val="3"/>
         </w:numPr>
         <w:spacing w:after="240" w:lineRule="auto"/>
         <w:ind w:left="720" w:hanging="360"/>
@@ -5383,11 +5447,6 @@
           <w:rtl w:val="0"/>
         </w:rPr>
         <w:t xml:space="preserve">Entrega Final: Consolidación del portafolio académico y entrega de la librería Python documentada a la contraparte técnica de Formulisa.</w:t>
-      </w:r>
-      <w:r>
-        <w:rPr>
-          <w:rtl w:val="0"/>
-        </w:rPr>
       </w:r>
     </w:p>
     <w:p>
@@ -15614,7 +15673,7 @@
           <w:rFonts w:ascii="Calibri" w:cs="Calibri" w:eastAsia="Calibri" w:hAnsi="Calibri"/>
           <w:rtl w:val="0"/>
         </w:rPr>
-        <w:t xml:space="preserve"> (versión 3.10.12 recomendada). Se utilizarán librerías específicas con versiones controladas para asegurar la estabilidad: </w:t>
+        <w:t xml:space="preserve"> (versión 3.8.10 recomendada). Se utilizarán librerías específicas con versiones controladas para asegurar la estabilidad: </w:t>
       </w:r>
       <w:r>
         <w:rPr>
@@ -15829,7 +15888,7 @@
           <w:rFonts w:ascii="Calibri" w:cs="Calibri" w:eastAsia="Calibri" w:hAnsi="Calibri"/>
           <w:rtl w:val="0"/>
         </w:rPr>
-        <w:t xml:space="preserve">La elección de Python 3.10.12 responde a su madurez en el ecosistema de Data Science y su capacidad para desarrollar la solución en formato de librería documentada, facilitando la transferencia técnica al cliente. </w:t>
+        <w:t xml:space="preserve">La elección de Python 3.8.10 responde a su madurez en el ecosistema de Data Science y su capacidad para desarrollar la solución en formato de librería documentada, facilitando la transferencia técnica al cliente. </w:t>
       </w:r>
     </w:p>
     <w:p>
@@ -16123,7 +16182,7 @@
         <w:widowControl w:val="0"/>
         <w:numPr>
           <w:ilvl w:val="0"/>
-          <w:numId w:val="6"/>
+          <w:numId w:val="8"/>
         </w:numPr>
         <w:spacing w:before="240" w:lineRule="auto"/>
         <w:ind w:left="720" w:hanging="360"/>
@@ -16153,7 +16212,7 @@
         <w:widowControl w:val="0"/>
         <w:numPr>
           <w:ilvl w:val="0"/>
-          <w:numId w:val="6"/>
+          <w:numId w:val="8"/>
         </w:numPr>
         <w:ind w:left="720" w:hanging="360"/>
         <w:rPr>
@@ -16182,7 +16241,7 @@
         <w:widowControl w:val="0"/>
         <w:numPr>
           <w:ilvl w:val="0"/>
-          <w:numId w:val="6"/>
+          <w:numId w:val="8"/>
         </w:numPr>
         <w:ind w:left="720" w:hanging="360"/>
         <w:rPr>
@@ -16211,7 +16270,7 @@
         <w:widowControl w:val="0"/>
         <w:numPr>
           <w:ilvl w:val="0"/>
-          <w:numId w:val="6"/>
+          <w:numId w:val="8"/>
         </w:numPr>
         <w:ind w:left="720" w:hanging="360"/>
         <w:rPr>
@@ -16240,7 +16299,7 @@
         <w:widowControl w:val="0"/>
         <w:numPr>
           <w:ilvl w:val="0"/>
-          <w:numId w:val="6"/>
+          <w:numId w:val="8"/>
         </w:numPr>
         <w:spacing w:after="240" w:lineRule="auto"/>
         <w:ind w:left="720" w:hanging="360"/>
@@ -16370,7 +16429,7 @@
         <w:widowControl w:val="0"/>
         <w:numPr>
           <w:ilvl w:val="0"/>
-          <w:numId w:val="11"/>
+          <w:numId w:val="3"/>
         </w:numPr>
         <w:pBdr>
           <w:top w:space="0" w:sz="0" w:val="nil"/>
@@ -16427,7 +16486,7 @@
         <w:widowControl w:val="0"/>
         <w:numPr>
           <w:ilvl w:val="0"/>
-          <w:numId w:val="11"/>
+          <w:numId w:val="3"/>
         </w:numPr>
         <w:pBdr>
           <w:top w:space="0" w:sz="0" w:val="nil"/>
@@ -16496,7 +16555,7 @@
         <w:widowControl w:val="0"/>
         <w:numPr>
           <w:ilvl w:val="0"/>
-          <w:numId w:val="11"/>
+          <w:numId w:val="3"/>
         </w:numPr>
         <w:pBdr>
           <w:top w:space="0" w:sz="0" w:val="nil"/>
@@ -16620,7 +16679,7 @@
         <w:widowControl w:val="0"/>
         <w:numPr>
           <w:ilvl w:val="0"/>
-          <w:numId w:val="11"/>
+          <w:numId w:val="3"/>
         </w:numPr>
         <w:pBdr>
           <w:top w:space="0" w:sz="0" w:val="nil"/>
@@ -16703,7 +16762,7 @@
         <w:widowControl w:val="0"/>
         <w:numPr>
           <w:ilvl w:val="0"/>
-          <w:numId w:val="11"/>
+          <w:numId w:val="3"/>
         </w:numPr>
         <w:pBdr>
           <w:top w:space="0" w:sz="0" w:val="nil"/>
@@ -16760,7 +16819,7 @@
         <w:widowControl w:val="0"/>
         <w:numPr>
           <w:ilvl w:val="0"/>
-          <w:numId w:val="11"/>
+          <w:numId w:val="3"/>
         </w:numPr>
         <w:pBdr>
           <w:top w:space="0" w:sz="0" w:val="nil"/>
@@ -16843,7 +16902,7 @@
         <w:widowControl w:val="0"/>
         <w:numPr>
           <w:ilvl w:val="0"/>
-          <w:numId w:val="11"/>
+          <w:numId w:val="3"/>
         </w:numPr>
         <w:pBdr>
           <w:top w:space="0" w:sz="0" w:val="nil"/>
@@ -16971,7 +17030,7 @@
           <w:rFonts w:ascii="Calibri" w:cs="Calibri" w:eastAsia="Calibri" w:hAnsi="Calibri"/>
           <w:rtl w:val="0"/>
         </w:rPr>
-        <w:t xml:space="preserve">La aplicación de este modelo evolutivo se organiza en tres etapas críticas dentro del ciclo de 12 semanas definido:</w:t>
+        <w:t xml:space="preserve">La aplicación de este modelo evolutivo se organiza en tres etapas críticas dentro del ciclo de 16 semanas definido:</w:t>
       </w:r>
     </w:p>
     <w:p>
@@ -16982,7 +17041,7 @@
         <w:widowControl w:val="0"/>
         <w:numPr>
           <w:ilvl w:val="0"/>
-          <w:numId w:val="11"/>
+          <w:numId w:val="3"/>
         </w:numPr>
         <w:pBdr>
           <w:top w:space="0" w:sz="0" w:val="nil"/>
@@ -17083,7 +17142,7 @@
         <w:widowControl w:val="0"/>
         <w:numPr>
           <w:ilvl w:val="0"/>
-          <w:numId w:val="7"/>
+          <w:numId w:val="9"/>
         </w:numPr>
         <w:ind w:left="720" w:hanging="360"/>
         <w:rPr>
@@ -17112,7 +17171,7 @@
         <w:widowControl w:val="0"/>
         <w:numPr>
           <w:ilvl w:val="0"/>
-          <w:numId w:val="7"/>
+          <w:numId w:val="9"/>
         </w:numPr>
         <w:ind w:left="720" w:hanging="360"/>
         <w:rPr>
@@ -17141,7 +17200,7 @@
         <w:widowControl w:val="0"/>
         <w:numPr>
           <w:ilvl w:val="0"/>
-          <w:numId w:val="7"/>
+          <w:numId w:val="9"/>
         </w:numPr>
         <w:ind w:left="720" w:hanging="360"/>
         <w:rPr>
@@ -17170,7 +17229,7 @@
         <w:widowControl w:val="0"/>
         <w:numPr>
           <w:ilvl w:val="0"/>
-          <w:numId w:val="7"/>
+          <w:numId w:val="9"/>
         </w:numPr>
         <w:ind w:left="720" w:hanging="360"/>
         <w:rPr>
@@ -17199,7 +17258,7 @@
         <w:widowControl w:val="0"/>
         <w:numPr>
           <w:ilvl w:val="0"/>
-          <w:numId w:val="7"/>
+          <w:numId w:val="9"/>
         </w:numPr>
         <w:spacing w:after="240" w:lineRule="auto"/>
         <w:ind w:left="720" w:hanging="360"/>
@@ -17391,12 +17450,12 @@
         <wp:inline distB="114300" distT="114300" distL="114300" distR="114300">
           <wp:extent cx="1646602" cy="404813"/>
           <wp:effectExtent b="0" l="0" r="0" t="0"/>
-          <wp:docPr id="2" name="image2.png"/>
+          <wp:docPr id="2" name="image1.png"/>
           <a:graphic>
             <a:graphicData uri="http://schemas.openxmlformats.org/drawingml/2006/picture">
               <pic:pic>
                 <pic:nvPicPr>
-                  <pic:cNvPr id="0" name="image2.png"/>
+                  <pic:cNvPr id="0" name="image1.png"/>
                   <pic:cNvPicPr preferRelativeResize="0"/>
                 </pic:nvPicPr>
                 <pic:blipFill>
@@ -17670,7 +17729,7 @@
     <w:lvl w:ilvl="0">
       <w:start w:val="1"/>
       <w:numFmt w:val="bullet"/>
-      <w:lvlText w:val="●"/>
+      <w:lvlText w:val="-"/>
       <w:lvlJc w:val="left"/>
       <w:pPr>
         <w:ind w:left="720" w:hanging="360"/>
@@ -17682,7 +17741,7 @@
     <w:lvl w:ilvl="1">
       <w:start w:val="1"/>
       <w:numFmt w:val="bullet"/>
-      <w:lvlText w:val="○"/>
+      <w:lvlText w:val="-"/>
       <w:lvlJc w:val="left"/>
       <w:pPr>
         <w:ind w:left="1440" w:hanging="360"/>
@@ -17694,7 +17753,7 @@
     <w:lvl w:ilvl="2">
       <w:start w:val="1"/>
       <w:numFmt w:val="bullet"/>
-      <w:lvlText w:val="■"/>
+      <w:lvlText w:val="-"/>
       <w:lvlJc w:val="left"/>
       <w:pPr>
         <w:ind w:left="2160" w:hanging="360"/>
@@ -17706,7 +17765,7 @@
     <w:lvl w:ilvl="3">
       <w:start w:val="1"/>
       <w:numFmt w:val="bullet"/>
-      <w:lvlText w:val="●"/>
+      <w:lvlText w:val="-"/>
       <w:lvlJc w:val="left"/>
       <w:pPr>
         <w:ind w:left="2880" w:hanging="360"/>
@@ -17718,7 +17777,7 @@
     <w:lvl w:ilvl="4">
       <w:start w:val="1"/>
       <w:numFmt w:val="bullet"/>
-      <w:lvlText w:val="○"/>
+      <w:lvlText w:val="-"/>
       <w:lvlJc w:val="left"/>
       <w:pPr>
         <w:ind w:left="3600" w:hanging="360"/>
@@ -17730,7 +17789,7 @@
     <w:lvl w:ilvl="5">
       <w:start w:val="1"/>
       <w:numFmt w:val="bullet"/>
-      <w:lvlText w:val="■"/>
+      <w:lvlText w:val="-"/>
       <w:lvlJc w:val="left"/>
       <w:pPr>
         <w:ind w:left="4320" w:hanging="360"/>
@@ -17742,7 +17801,7 @@
     <w:lvl w:ilvl="6">
       <w:start w:val="1"/>
       <w:numFmt w:val="bullet"/>
-      <w:lvlText w:val="●"/>
+      <w:lvlText w:val="-"/>
       <w:lvlJc w:val="left"/>
       <w:pPr>
         <w:ind w:left="5040" w:hanging="360"/>
@@ -17754,7 +17813,7 @@
     <w:lvl w:ilvl="7">
       <w:start w:val="1"/>
       <w:numFmt w:val="bullet"/>
-      <w:lvlText w:val="○"/>
+      <w:lvlText w:val="-"/>
       <w:lvlJc w:val="left"/>
       <w:pPr>
         <w:ind w:left="5760" w:hanging="360"/>
@@ -17766,7 +17825,7 @@
     <w:lvl w:ilvl="8">
       <w:start w:val="1"/>
       <w:numFmt w:val="bullet"/>
-      <w:lvlText w:val="■"/>
+      <w:lvlText w:val="-"/>
       <w:lvlJc w:val="left"/>
       <w:pPr>
         <w:ind w:left="6480" w:hanging="360"/>
@@ -17890,6 +17949,116 @@
     <w:lvl w:ilvl="0">
       <w:start w:val="1"/>
       <w:numFmt w:val="bullet"/>
+      <w:lvlText w:val="●"/>
+      <w:lvlJc w:val="left"/>
+      <w:pPr>
+        <w:ind w:left="720" w:hanging="360"/>
+      </w:pPr>
+      <w:rPr>
+        <w:u w:val="none"/>
+      </w:rPr>
+    </w:lvl>
+    <w:lvl w:ilvl="1">
+      <w:start w:val="1"/>
+      <w:numFmt w:val="bullet"/>
+      <w:lvlText w:val="○"/>
+      <w:lvlJc w:val="left"/>
+      <w:pPr>
+        <w:ind w:left="1440" w:hanging="360"/>
+      </w:pPr>
+      <w:rPr>
+        <w:u w:val="none"/>
+      </w:rPr>
+    </w:lvl>
+    <w:lvl w:ilvl="2">
+      <w:start w:val="1"/>
+      <w:numFmt w:val="bullet"/>
+      <w:lvlText w:val="■"/>
+      <w:lvlJc w:val="left"/>
+      <w:pPr>
+        <w:ind w:left="2160" w:hanging="360"/>
+      </w:pPr>
+      <w:rPr>
+        <w:u w:val="none"/>
+      </w:rPr>
+    </w:lvl>
+    <w:lvl w:ilvl="3">
+      <w:start w:val="1"/>
+      <w:numFmt w:val="bullet"/>
+      <w:lvlText w:val="●"/>
+      <w:lvlJc w:val="left"/>
+      <w:pPr>
+        <w:ind w:left="2880" w:hanging="360"/>
+      </w:pPr>
+      <w:rPr>
+        <w:u w:val="none"/>
+      </w:rPr>
+    </w:lvl>
+    <w:lvl w:ilvl="4">
+      <w:start w:val="1"/>
+      <w:numFmt w:val="bullet"/>
+      <w:lvlText w:val="○"/>
+      <w:lvlJc w:val="left"/>
+      <w:pPr>
+        <w:ind w:left="3600" w:hanging="360"/>
+      </w:pPr>
+      <w:rPr>
+        <w:u w:val="none"/>
+      </w:rPr>
+    </w:lvl>
+    <w:lvl w:ilvl="5">
+      <w:start w:val="1"/>
+      <w:numFmt w:val="bullet"/>
+      <w:lvlText w:val="■"/>
+      <w:lvlJc w:val="left"/>
+      <w:pPr>
+        <w:ind w:left="4320" w:hanging="360"/>
+      </w:pPr>
+      <w:rPr>
+        <w:u w:val="none"/>
+      </w:rPr>
+    </w:lvl>
+    <w:lvl w:ilvl="6">
+      <w:start w:val="1"/>
+      <w:numFmt w:val="bullet"/>
+      <w:lvlText w:val="●"/>
+      <w:lvlJc w:val="left"/>
+      <w:pPr>
+        <w:ind w:left="5040" w:hanging="360"/>
+      </w:pPr>
+      <w:rPr>
+        <w:u w:val="none"/>
+      </w:rPr>
+    </w:lvl>
+    <w:lvl w:ilvl="7">
+      <w:start w:val="1"/>
+      <w:numFmt w:val="bullet"/>
+      <w:lvlText w:val="○"/>
+      <w:lvlJc w:val="left"/>
+      <w:pPr>
+        <w:ind w:left="5760" w:hanging="360"/>
+      </w:pPr>
+      <w:rPr>
+        <w:u w:val="none"/>
+      </w:rPr>
+    </w:lvl>
+    <w:lvl w:ilvl="8">
+      <w:start w:val="1"/>
+      <w:numFmt w:val="bullet"/>
+      <w:lvlText w:val="■"/>
+      <w:lvlJc w:val="left"/>
+      <w:pPr>
+        <w:ind w:left="6480" w:hanging="360"/>
+      </w:pPr>
+      <w:rPr>
+        <w:u w:val="none"/>
+      </w:rPr>
+    </w:lvl>
+  </w:abstractNum>
+  <w:abstractNum w:abstractNumId="6">
+    <w:lvl w:ilvl="0">
+      <w:start w:val="1"/>
+      <w:numFmt w:val="bullet"/>
       <w:lvlText w:val="-"/>
       <w:lvlJc w:val="left"/>
       <w:pPr>
@@ -17996,7 +18165,117 @@
       </w:rPr>
     </w:lvl>
   </w:abstractNum>
-  <w:abstractNum w:abstractNumId="6">
+  <w:abstractNum w:abstractNumId="7">
+    <w:lvl w:ilvl="0">
+      <w:start w:val="1"/>
+      <w:numFmt w:val="bullet"/>
+      <w:lvlText w:val="-"/>
+      <w:lvlJc w:val="left"/>
+      <w:pPr>
+        <w:ind w:left="720" w:hanging="360"/>
+      </w:pPr>
+      <w:rPr>
+        <w:u w:val="none"/>
+      </w:rPr>
+    </w:lvl>
+    <w:lvl w:ilvl="1">
+      <w:start w:val="1"/>
+      <w:numFmt w:val="bullet"/>
+      <w:lvlText w:val="-"/>
+      <w:lvlJc w:val="left"/>
+      <w:pPr>
+        <w:ind w:left="1440" w:hanging="360"/>
+      </w:pPr>
+      <w:rPr>
+        <w:u w:val="none"/>
+      </w:rPr>
+    </w:lvl>
+    <w:lvl w:ilvl="2">
+      <w:start w:val="1"/>
+      <w:numFmt w:val="bullet"/>
+      <w:lvlText w:val="-"/>
+      <w:lvlJc w:val="left"/>
+      <w:pPr>
+        <w:ind w:left="2160" w:hanging="360"/>
+      </w:pPr>
+      <w:rPr>
+        <w:u w:val="none"/>
+      </w:rPr>
+    </w:lvl>
+    <w:lvl w:ilvl="3">
+      <w:start w:val="1"/>
+      <w:numFmt w:val="bullet"/>
+      <w:lvlText w:val="-"/>
+      <w:lvlJc w:val="left"/>
+      <w:pPr>
+        <w:ind w:left="2880" w:hanging="360"/>
+      </w:pPr>
+      <w:rPr>
+        <w:u w:val="none"/>
+      </w:rPr>
+    </w:lvl>
+    <w:lvl w:ilvl="4">
+      <w:start w:val="1"/>
+      <w:numFmt w:val="bullet"/>
+      <w:lvlText w:val="-"/>
+      <w:lvlJc w:val="left"/>
+      <w:pPr>
+        <w:ind w:left="3600" w:hanging="360"/>
+      </w:pPr>
+      <w:rPr>
+        <w:u w:val="none"/>
+      </w:rPr>
+    </w:lvl>
+    <w:lvl w:ilvl="5">
+      <w:start w:val="1"/>
+      <w:numFmt w:val="bullet"/>
+      <w:lvlText w:val="-"/>
+      <w:lvlJc w:val="left"/>
+      <w:pPr>
+        <w:ind w:left="4320" w:hanging="360"/>
+      </w:pPr>
+      <w:rPr>
+        <w:u w:val="none"/>
+      </w:rPr>
+    </w:lvl>
+    <w:lvl w:ilvl="6">
+      <w:start w:val="1"/>
+      <w:numFmt w:val="bullet"/>
+      <w:lvlText w:val="-"/>
+      <w:lvlJc w:val="left"/>
+      <w:pPr>
+        <w:ind w:left="5040" w:hanging="360"/>
+      </w:pPr>
+      <w:rPr>
+        <w:u w:val="none"/>
+      </w:rPr>
+    </w:lvl>
+    <w:lvl w:ilvl="7">
+      <w:start w:val="1"/>
+      <w:numFmt w:val="bullet"/>
+      <w:lvlText w:val="-"/>
+      <w:lvlJc w:val="left"/>
+      <w:pPr>
+        <w:ind w:left="5760" w:hanging="360"/>
+      </w:pPr>
+      <w:rPr>
+        <w:u w:val="none"/>
+      </w:rPr>
+    </w:lvl>
+    <w:lvl w:ilvl="8">
+      <w:start w:val="1"/>
+      <w:numFmt w:val="bullet"/>
+      <w:lvlText w:val="-"/>
+      <w:lvlJc w:val="left"/>
+      <w:pPr>
+        <w:ind w:left="6480" w:hanging="360"/>
+      </w:pPr>
+      <w:rPr>
+        <w:u w:val="none"/>
+      </w:rPr>
+    </w:lvl>
+  </w:abstractNum>
+  <w:abstractNum w:abstractNumId="8">
     <w:lvl w:ilvl="0">
       <w:start w:val="1"/>
       <w:numFmt w:val="bullet"/>
@@ -18107,7 +18386,7 @@
       </w:rPr>
     </w:lvl>
   </w:abstractNum>
-  <w:abstractNum w:abstractNumId="7">
+  <w:abstractNum w:abstractNumId="9">
     <w:lvl w:ilvl="0">
       <w:start w:val="1"/>
       <w:numFmt w:val="bullet"/>
@@ -18209,226 +18488,6 @@
       <w:start w:val="1"/>
       <w:numFmt w:val="bullet"/>
       <w:lvlText w:val="■"/>
-      <w:lvlJc w:val="left"/>
-      <w:pPr>
-        <w:ind w:left="6480" w:hanging="360"/>
-      </w:pPr>
-      <w:rPr>
-        <w:u w:val="none"/>
-      </w:rPr>
-    </w:lvl>
-  </w:abstractNum>
-  <w:abstractNum w:abstractNumId="8">
-    <w:lvl w:ilvl="0">
-      <w:start w:val="1"/>
-      <w:numFmt w:val="bullet"/>
-      <w:lvlText w:val="-"/>
-      <w:lvlJc w:val="left"/>
-      <w:pPr>
-        <w:ind w:left="720" w:hanging="360"/>
-      </w:pPr>
-      <w:rPr>
-        <w:u w:val="none"/>
-      </w:rPr>
-    </w:lvl>
-    <w:lvl w:ilvl="1">
-      <w:start w:val="1"/>
-      <w:numFmt w:val="bullet"/>
-      <w:lvlText w:val="-"/>
-      <w:lvlJc w:val="left"/>
-      <w:pPr>
-        <w:ind w:left="1440" w:hanging="360"/>
-      </w:pPr>
-      <w:rPr>
-        <w:u w:val="none"/>
-      </w:rPr>
-    </w:lvl>
-    <w:lvl w:ilvl="2">
-      <w:start w:val="1"/>
-      <w:numFmt w:val="bullet"/>
-      <w:lvlText w:val="-"/>
-      <w:lvlJc w:val="left"/>
-      <w:pPr>
-        <w:ind w:left="2160" w:hanging="360"/>
-      </w:pPr>
-      <w:rPr>
-        <w:u w:val="none"/>
-      </w:rPr>
-    </w:lvl>
-    <w:lvl w:ilvl="3">
-      <w:start w:val="1"/>
-      <w:numFmt w:val="bullet"/>
-      <w:lvlText w:val="-"/>
-      <w:lvlJc w:val="left"/>
-      <w:pPr>
-        <w:ind w:left="2880" w:hanging="360"/>
-      </w:pPr>
-      <w:rPr>
-        <w:u w:val="none"/>
-      </w:rPr>
-    </w:lvl>
-    <w:lvl w:ilvl="4">
-      <w:start w:val="1"/>
-      <w:numFmt w:val="bullet"/>
-      <w:lvlText w:val="-"/>
-      <w:lvlJc w:val="left"/>
-      <w:pPr>
-        <w:ind w:left="3600" w:hanging="360"/>
-      </w:pPr>
-      <w:rPr>
-        <w:u w:val="none"/>
-      </w:rPr>
-    </w:lvl>
-    <w:lvl w:ilvl="5">
-      <w:start w:val="1"/>
-      <w:numFmt w:val="bullet"/>
-      <w:lvlText w:val="-"/>
-      <w:lvlJc w:val="left"/>
-      <w:pPr>
-        <w:ind w:left="4320" w:hanging="360"/>
-      </w:pPr>
-      <w:rPr>
-        <w:u w:val="none"/>
-      </w:rPr>
-    </w:lvl>
-    <w:lvl w:ilvl="6">
-      <w:start w:val="1"/>
-      <w:numFmt w:val="bullet"/>
-      <w:lvlText w:val="-"/>
-      <w:lvlJc w:val="left"/>
-      <w:pPr>
-        <w:ind w:left="5040" w:hanging="360"/>
-      </w:pPr>
-      <w:rPr>
-        <w:u w:val="none"/>
-      </w:rPr>
-    </w:lvl>
-    <w:lvl w:ilvl="7">
-      <w:start w:val="1"/>
-      <w:numFmt w:val="bullet"/>
-      <w:lvlText w:val="-"/>
-      <w:lvlJc w:val="left"/>
-      <w:pPr>
-        <w:ind w:left="5760" w:hanging="360"/>
-      </w:pPr>
-      <w:rPr>
-        <w:u w:val="none"/>
-      </w:rPr>
-    </w:lvl>
-    <w:lvl w:ilvl="8">
-      <w:start w:val="1"/>
-      <w:numFmt w:val="bullet"/>
-      <w:lvlText w:val="-"/>
-      <w:lvlJc w:val="left"/>
-      <w:pPr>
-        <w:ind w:left="6480" w:hanging="360"/>
-      </w:pPr>
-      <w:rPr>
-        <w:u w:val="none"/>
-      </w:rPr>
-    </w:lvl>
-  </w:abstractNum>
-  <w:abstractNum w:abstractNumId="9">
-    <w:lvl w:ilvl="0">
-      <w:start w:val="1"/>
-      <w:numFmt w:val="bullet"/>
-      <w:lvlText w:val="-"/>
-      <w:lvlJc w:val="left"/>
-      <w:pPr>
-        <w:ind w:left="720" w:hanging="360"/>
-      </w:pPr>
-      <w:rPr>
-        <w:u w:val="none"/>
-      </w:rPr>
-    </w:lvl>
-    <w:lvl w:ilvl="1">
-      <w:start w:val="1"/>
-      <w:numFmt w:val="bullet"/>
-      <w:lvlText w:val="-"/>
-      <w:lvlJc w:val="left"/>
-      <w:pPr>
-        <w:ind w:left="1440" w:hanging="360"/>
-      </w:pPr>
-      <w:rPr>
-        <w:u w:val="none"/>
-      </w:rPr>
-    </w:lvl>
-    <w:lvl w:ilvl="2">
-      <w:start w:val="1"/>
-      <w:numFmt w:val="bullet"/>
-      <w:lvlText w:val="-"/>
-      <w:lvlJc w:val="left"/>
-      <w:pPr>
-        <w:ind w:left="2160" w:hanging="360"/>
-      </w:pPr>
-      <w:rPr>
-        <w:u w:val="none"/>
-      </w:rPr>
-    </w:lvl>
-    <w:lvl w:ilvl="3">
-      <w:start w:val="1"/>
-      <w:numFmt w:val="bullet"/>
-      <w:lvlText w:val="-"/>
-      <w:lvlJc w:val="left"/>
-      <w:pPr>
-        <w:ind w:left="2880" w:hanging="360"/>
-      </w:pPr>
-      <w:rPr>
-        <w:u w:val="none"/>
-      </w:rPr>
-    </w:lvl>
-    <w:lvl w:ilvl="4">
-      <w:start w:val="1"/>
-      <w:numFmt w:val="bullet"/>
-      <w:lvlText w:val="-"/>
-      <w:lvlJc w:val="left"/>
-      <w:pPr>
-        <w:ind w:left="3600" w:hanging="360"/>
-      </w:pPr>
-      <w:rPr>
-        <w:u w:val="none"/>
-      </w:rPr>
-    </w:lvl>
-    <w:lvl w:ilvl="5">
-      <w:start w:val="1"/>
-      <w:numFmt w:val="bullet"/>
-      <w:lvlText w:val="-"/>
-      <w:lvlJc w:val="left"/>
-      <w:pPr>
-        <w:ind w:left="4320" w:hanging="360"/>
-      </w:pPr>
-      <w:rPr>
-        <w:u w:val="none"/>
-      </w:rPr>
-    </w:lvl>
-    <w:lvl w:ilvl="6">
-      <w:start w:val="1"/>
-      <w:numFmt w:val="bullet"/>
-      <w:lvlText w:val="-"/>
-      <w:lvlJc w:val="left"/>
-      <w:pPr>
-        <w:ind w:left="5040" w:hanging="360"/>
-      </w:pPr>
-      <w:rPr>
-        <w:u w:val="none"/>
-      </w:rPr>
-    </w:lvl>
-    <w:lvl w:ilvl="7">
-      <w:start w:val="1"/>
-      <w:numFmt w:val="bullet"/>
-      <w:lvlText w:val="-"/>
-      <w:lvlJc w:val="left"/>
-      <w:pPr>
-        <w:ind w:left="5760" w:hanging="360"/>
-      </w:pPr>
-      <w:rPr>
-        <w:u w:val="none"/>
-      </w:rPr>
-    </w:lvl>
-    <w:lvl w:ilvl="8">
-      <w:start w:val="1"/>
-      <w:numFmt w:val="bullet"/>
-      <w:lvlText w:val="-"/>
       <w:lvlJc w:val="left"/>
       <w:pPr>
         <w:ind w:left="6480" w:hanging="360"/>
@@ -19206,7 +19265,7 @@
 
 <file path=customXML/item1.xml><?xml version="1.0" encoding="utf-8"?>
 <go:gDocsCustomXmlDataStorage xmlns:go="http://customooxmlschemas.google.com/" xmlns:r="http://schemas.openxmlformats.org/officeDocument/2006/relationships" uri="GoogleDocsCustomDataVersion2">
-  <go:docsCustomData xmlns:go="http://customooxmlschemas.google.com/" roundtripDataSignature="AMtx7mjmL1EI4MRFpAuiyxTwQZ8WI9HTsw==">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</go:docsCustomData>
+  <go:docsCustomData xmlns:go="http://customooxmlschemas.google.com/" roundtripDataSignature="AMtx7mivqdzEUPciPjH2W6uLVQSrftPbLQ==">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</go:docsCustomData>
 </go:gDocsCustomXmlDataStorage>
 </file>
 

</xml_diff>